<commit_message>
starting data provisioning, merging both datasets
</commit_message>
<xml_diff>
--- a/docs/Analytic approach.docx
+++ b/docs/Analytic approach.docx
@@ -246,7 +246,6 @@
                                         <w:szCs w:val="24"/>
                                       </w:rPr>
                                     </w:pPr>
-                                    <w:proofErr w:type="gramStart"/>
                                     <w:r>
                                       <w:rPr>
                                         <w:caps/>
@@ -254,17 +253,7 @@
                                         <w:sz w:val="24"/>
                                         <w:szCs w:val="24"/>
                                       </w:rPr>
-                                      <w:t>Slavova,Katerina</w:t>
-                                    </w:r>
-                                    <w:proofErr w:type="gramEnd"/>
-                                    <w:r>
-                                      <w:rPr>
-                                        <w:caps/>
-                                        <w:color w:val="5B9BD5" w:themeColor="accent5"/>
-                                        <w:sz w:val="24"/>
-                                        <w:szCs w:val="24"/>
-                                      </w:rPr>
-                                      <w:t xml:space="preserve"> K.S.</w:t>
+                                      <w:t>Slavova,Katerina K.S.</w:t>
                                     </w:r>
                                   </w:p>
                                 </w:sdtContent>
@@ -400,7 +389,6 @@
                                   <w:szCs w:val="24"/>
                                 </w:rPr>
                               </w:pPr>
-                              <w:proofErr w:type="gramStart"/>
                               <w:r>
                                 <w:rPr>
                                   <w:caps/>
@@ -408,17 +396,7 @@
                                   <w:sz w:val="24"/>
                                   <w:szCs w:val="24"/>
                                 </w:rPr>
-                                <w:t>Slavova,Katerina</w:t>
-                              </w:r>
-                              <w:proofErr w:type="gramEnd"/>
-                              <w:r>
-                                <w:rPr>
-                                  <w:caps/>
-                                  <w:color w:val="5B9BD5" w:themeColor="accent5"/>
-                                  <w:sz w:val="24"/>
-                                  <w:szCs w:val="24"/>
-                                </w:rPr>
-                                <w:t xml:space="preserve"> K.S.</w:t>
+                                <w:t>Slavova,Katerina K.S.</w:t>
                               </w:r>
                             </w:p>
                           </w:sdtContent>
@@ -1924,7 +1902,6 @@
           </wp:anchor>
         </w:drawing>
       </w:r>
-      <w:proofErr w:type="spellStart"/>
       <w:r>
         <w:rPr>
           <w:b/>
@@ -1934,7 +1911,6 @@
         </w:rPr>
         <w:t>DistilBERT</w:t>
       </w:r>
-      <w:proofErr w:type="spellEnd"/>
       <w:r>
         <w:rPr>
           <w:b/>
@@ -2173,7 +2149,14 @@
           <w:sz w:val="28"/>
           <w:szCs w:val="28"/>
         </w:rPr>
-        <w:t>compares the set of predicted labels to the set of true labels for each message</w:t>
+        <w:t>compares the set of predicted labels to the set of true labels for each messag</w:t>
+      </w:r>
+      <w:r>
+        <w:rPr>
+          <w:sz w:val="28"/>
+          <w:szCs w:val="28"/>
+        </w:rPr>
+        <w:t>e</w:t>
       </w:r>
     </w:p>
     <w:sectPr>
@@ -2191,6 +2174,119 @@
 <file path=word/numbering.xml><?xml version="1.0" encoding="utf-8"?>
 <w:numbering xmlns:wpc="http://schemas.microsoft.com/office/word/2010/wordprocessingCanvas" xmlns:cx="http://schemas.microsoft.com/office/drawing/2014/chartex" xmlns:cx1="http://schemas.microsoft.com/office/drawing/2015/9/8/chartex" xmlns:cx2="http://schemas.microsoft.com/office/drawing/2015/10/21/chartex" xmlns:cx3="http://schemas.microsoft.com/office/drawing/2016/5/9/chartex" xmlns:cx4="http://schemas.microsoft.com/office/drawing/2016/5/10/chartex" xmlns:cx5="http://schemas.microsoft.com/office/drawing/2016/5/11/chartex" xmlns:cx6="http://schemas.microsoft.com/office/drawing/2016/5/12/chartex" xmlns:cx7="http://schemas.microsoft.com/office/drawing/2016/5/13/chartex" xmlns:cx8="http://schemas.microsoft.com/office/drawing/2016/5/14/chartex" xmlns:mc="http://schemas.openxmlformats.org/markup-compatibility/2006" xmlns:aink="http://schemas.microsoft.com/office/drawing/2016/ink" xmlns:am3d="http://schemas.microsoft.com/office/drawing/2017/model3d" xmlns:o="urn:schemas-microsoft-com:office:office" xmlns:r="http://schemas.openxmlformats.org/officeDocument/2006/relationships" xmlns:m="http://schemas.openxmlformats.org/officeDocument/2006/math" xmlns:v="urn:schemas-microsoft-com:vml" xmlns:wp14="http://schemas.microsoft.com/office/word/2010/wordprocessingDrawing" xmlns:wp="http://schemas.openxmlformats.org/drawingml/2006/wordprocessingDrawing" xmlns:w10="urn:schemas-microsoft-com:office:word" xmlns:w="http://schemas.openxmlformats.org/wordprocessingml/2006/main" xmlns:w14="http://schemas.microsoft.com/office/word/2010/wordml" xmlns:w15="http://schemas.microsoft.com/office/word/2012/wordml" xmlns:w16cex="http://schemas.microsoft.com/office/word/2018/wordml/cex" xmlns:w16cid="http://schemas.microsoft.com/office/word/2016/wordml/cid" xmlns:w16="http://schemas.microsoft.com/office/word/2018/wordml" xmlns:w16sdtdh="http://schemas.microsoft.com/office/word/2020/wordml/sdtdatahash" xmlns:w16se="http://schemas.microsoft.com/office/word/2015/wordml/symex" xmlns:wpg="http://schemas.microsoft.com/office/word/2010/wordprocessingGroup" xmlns:wpi="http://schemas.microsoft.com/office/word/2010/wordprocessingInk" xmlns:wne="http://schemas.microsoft.com/office/word/2006/wordml" xmlns:wps="http://schemas.microsoft.com/office/word/2010/wordprocessingShape" mc:Ignorable="w14 w15 w16se w16cid w16 w16cex w16sdtdh wp14">
   <w:abstractNum w:abstractNumId="0" w15:restartNumberingAfterBreak="0">
+    <w:nsid w:val="2EE547A1"/>
+    <w:multiLevelType w:val="hybridMultilevel"/>
+    <w:tmpl w:val="5D42343E"/>
+    <w:lvl w:ilvl="0" w:tplc="04090001">
+      <w:start w:val="1"/>
+      <w:numFmt w:val="bullet"/>
+      <w:lvlText w:val=""/>
+      <w:lvlJc w:val="left"/>
+      <w:pPr>
+        <w:ind w:left="720" w:hanging="360"/>
+      </w:pPr>
+      <w:rPr>
+        <w:rFonts w:ascii="Symbol" w:hAnsi="Symbol" w:hint="default"/>
+      </w:rPr>
+    </w:lvl>
+    <w:lvl w:ilvl="1" w:tplc="04090003" w:tentative="1">
+      <w:start w:val="1"/>
+      <w:numFmt w:val="bullet"/>
+      <w:lvlText w:val="o"/>
+      <w:lvlJc w:val="left"/>
+      <w:pPr>
+        <w:ind w:left="1440" w:hanging="360"/>
+      </w:pPr>
+      <w:rPr>
+        <w:rFonts w:ascii="Courier New" w:hAnsi="Courier New" w:cs="Courier New" w:hint="default"/>
+      </w:rPr>
+    </w:lvl>
+    <w:lvl w:ilvl="2" w:tplc="04090005" w:tentative="1">
+      <w:start w:val="1"/>
+      <w:numFmt w:val="bullet"/>
+      <w:lvlText w:val=""/>
+      <w:lvlJc w:val="left"/>
+      <w:pPr>
+        <w:ind w:left="2160" w:hanging="360"/>
+      </w:pPr>
+      <w:rPr>
+        <w:rFonts w:ascii="Wingdings" w:hAnsi="Wingdings" w:hint="default"/>
+      </w:rPr>
+    </w:lvl>
+    <w:lvl w:ilvl="3" w:tplc="04090001" w:tentative="1">
+      <w:start w:val="1"/>
+      <w:numFmt w:val="bullet"/>
+      <w:lvlText w:val=""/>
+      <w:lvlJc w:val="left"/>
+      <w:pPr>
+        <w:ind w:left="2880" w:hanging="360"/>
+      </w:pPr>
+      <w:rPr>
+        <w:rFonts w:ascii="Symbol" w:hAnsi="Symbol" w:hint="default"/>
+      </w:rPr>
+    </w:lvl>
+    <w:lvl w:ilvl="4" w:tplc="04090003" w:tentative="1">
+      <w:start w:val="1"/>
+      <w:numFmt w:val="bullet"/>
+      <w:lvlText w:val="o"/>
+      <w:lvlJc w:val="left"/>
+      <w:pPr>
+        <w:ind w:left="3600" w:hanging="360"/>
+      </w:pPr>
+      <w:rPr>
+        <w:rFonts w:ascii="Courier New" w:hAnsi="Courier New" w:cs="Courier New" w:hint="default"/>
+      </w:rPr>
+    </w:lvl>
+    <w:lvl w:ilvl="5" w:tplc="04090005" w:tentative="1">
+      <w:start w:val="1"/>
+      <w:numFmt w:val="bullet"/>
+      <w:lvlText w:val=""/>
+      <w:lvlJc w:val="left"/>
+      <w:pPr>
+        <w:ind w:left="4320" w:hanging="360"/>
+      </w:pPr>
+      <w:rPr>
+        <w:rFonts w:ascii="Wingdings" w:hAnsi="Wingdings" w:hint="default"/>
+      </w:rPr>
+    </w:lvl>
+    <w:lvl w:ilvl="6" w:tplc="04090001" w:tentative="1">
+      <w:start w:val="1"/>
+      <w:numFmt w:val="bullet"/>
+      <w:lvlText w:val=""/>
+      <w:lvlJc w:val="left"/>
+      <w:pPr>
+        <w:ind w:left="5040" w:hanging="360"/>
+      </w:pPr>
+      <w:rPr>
+        <w:rFonts w:ascii="Symbol" w:hAnsi="Symbol" w:hint="default"/>
+      </w:rPr>
+    </w:lvl>
+    <w:lvl w:ilvl="7" w:tplc="04090003" w:tentative="1">
+      <w:start w:val="1"/>
+      <w:numFmt w:val="bullet"/>
+      <w:lvlText w:val="o"/>
+      <w:lvlJc w:val="left"/>
+      <w:pPr>
+        <w:ind w:left="5760" w:hanging="360"/>
+      </w:pPr>
+      <w:rPr>
+        <w:rFonts w:ascii="Courier New" w:hAnsi="Courier New" w:cs="Courier New" w:hint="default"/>
+      </w:rPr>
+    </w:lvl>
+    <w:lvl w:ilvl="8" w:tplc="04090005" w:tentative="1">
+      <w:start w:val="1"/>
+      <w:numFmt w:val="bullet"/>
+      <w:lvlText w:val=""/>
+      <w:lvlJc w:val="left"/>
+      <w:pPr>
+        <w:ind w:left="6480" w:hanging="360"/>
+      </w:pPr>
+      <w:rPr>
+        <w:rFonts w:ascii="Wingdings" w:hAnsi="Wingdings" w:hint="default"/>
+      </w:rPr>
+    </w:lvl>
+  </w:abstractNum>
+  <w:abstractNum w:abstractNumId="1" w15:restartNumberingAfterBreak="0">
     <w:nsid w:val="3A686BF7"/>
     <w:multiLevelType w:val="hybridMultilevel"/>
     <w:tmpl w:val="5EAEBE20"/>
@@ -2303,7 +2399,7 @@
       </w:rPr>
     </w:lvl>
   </w:abstractNum>
-  <w:abstractNum w:abstractNumId="1" w15:restartNumberingAfterBreak="0">
+  <w:abstractNum w:abstractNumId="2" w15:restartNumberingAfterBreak="0">
     <w:nsid w:val="4B5D6264"/>
     <w:multiLevelType w:val="hybridMultilevel"/>
     <w:tmpl w:val="C51C3FC2"/>
@@ -2416,7 +2512,93 @@
       </w:rPr>
     </w:lvl>
   </w:abstractNum>
-  <w:abstractNum w:abstractNumId="2" w15:restartNumberingAfterBreak="0">
+  <w:abstractNum w:abstractNumId="3" w15:restartNumberingAfterBreak="0">
+    <w:nsid w:val="538306D8"/>
+    <w:multiLevelType w:val="hybridMultilevel"/>
+    <w:tmpl w:val="849E49A2"/>
+    <w:lvl w:ilvl="0" w:tplc="0409000F">
+      <w:start w:val="1"/>
+      <w:numFmt w:val="decimal"/>
+      <w:lvlText w:val="%1."/>
+      <w:lvlJc w:val="left"/>
+      <w:pPr>
+        <w:ind w:left="720" w:hanging="360"/>
+      </w:pPr>
+    </w:lvl>
+    <w:lvl w:ilvl="1" w:tplc="04090019" w:tentative="1">
+      <w:start w:val="1"/>
+      <w:numFmt w:val="lowerLetter"/>
+      <w:lvlText w:val="%2."/>
+      <w:lvlJc w:val="left"/>
+      <w:pPr>
+        <w:ind w:left="1440" w:hanging="360"/>
+      </w:pPr>
+    </w:lvl>
+    <w:lvl w:ilvl="2" w:tplc="0409001B" w:tentative="1">
+      <w:start w:val="1"/>
+      <w:numFmt w:val="lowerRoman"/>
+      <w:lvlText w:val="%3."/>
+      <w:lvlJc w:val="right"/>
+      <w:pPr>
+        <w:ind w:left="2160" w:hanging="180"/>
+      </w:pPr>
+    </w:lvl>
+    <w:lvl w:ilvl="3" w:tplc="0409000F" w:tentative="1">
+      <w:start w:val="1"/>
+      <w:numFmt w:val="decimal"/>
+      <w:lvlText w:val="%4."/>
+      <w:lvlJc w:val="left"/>
+      <w:pPr>
+        <w:ind w:left="2880" w:hanging="360"/>
+      </w:pPr>
+    </w:lvl>
+    <w:lvl w:ilvl="4" w:tplc="04090019" w:tentative="1">
+      <w:start w:val="1"/>
+      <w:numFmt w:val="lowerLetter"/>
+      <w:lvlText w:val="%5."/>
+      <w:lvlJc w:val="left"/>
+      <w:pPr>
+        <w:ind w:left="3600" w:hanging="360"/>
+      </w:pPr>
+    </w:lvl>
+    <w:lvl w:ilvl="5" w:tplc="0409001B" w:tentative="1">
+      <w:start w:val="1"/>
+      <w:numFmt w:val="lowerRoman"/>
+      <w:lvlText w:val="%6."/>
+      <w:lvlJc w:val="right"/>
+      <w:pPr>
+        <w:ind w:left="4320" w:hanging="180"/>
+      </w:pPr>
+    </w:lvl>
+    <w:lvl w:ilvl="6" w:tplc="0409000F" w:tentative="1">
+      <w:start w:val="1"/>
+      <w:numFmt w:val="decimal"/>
+      <w:lvlText w:val="%7."/>
+      <w:lvlJc w:val="left"/>
+      <w:pPr>
+        <w:ind w:left="5040" w:hanging="360"/>
+      </w:pPr>
+    </w:lvl>
+    <w:lvl w:ilvl="7" w:tplc="04090019" w:tentative="1">
+      <w:start w:val="1"/>
+      <w:numFmt w:val="lowerLetter"/>
+      <w:lvlText w:val="%8."/>
+      <w:lvlJc w:val="left"/>
+      <w:pPr>
+        <w:ind w:left="5760" w:hanging="360"/>
+      </w:pPr>
+    </w:lvl>
+    <w:lvl w:ilvl="8" w:tplc="0409001B" w:tentative="1">
+      <w:start w:val="1"/>
+      <w:numFmt w:val="lowerRoman"/>
+      <w:lvlText w:val="%9."/>
+      <w:lvlJc w:val="right"/>
+      <w:pPr>
+        <w:ind w:left="6480" w:hanging="180"/>
+      </w:pPr>
+    </w:lvl>
+  </w:abstractNum>
+  <w:abstractNum w:abstractNumId="4" w15:restartNumberingAfterBreak="0">
     <w:nsid w:val="5AE84915"/>
     <w:multiLevelType w:val="hybridMultilevel"/>
     <w:tmpl w:val="DEF8888E"/>
@@ -2529,7 +2711,7 @@
       </w:rPr>
     </w:lvl>
   </w:abstractNum>
-  <w:abstractNum w:abstractNumId="3" w15:restartNumberingAfterBreak="0">
+  <w:abstractNum w:abstractNumId="5" w15:restartNumberingAfterBreak="0">
     <w:nsid w:val="65A374AF"/>
     <w:multiLevelType w:val="multilevel"/>
     <w:tmpl w:val="80FE09C4"/>
@@ -2642,7 +2824,7 @@
       </w:rPr>
     </w:lvl>
   </w:abstractNum>
-  <w:abstractNum w:abstractNumId="4" w15:restartNumberingAfterBreak="0">
+  <w:abstractNum w:abstractNumId="6" w15:restartNumberingAfterBreak="0">
     <w:nsid w:val="6D11687B"/>
     <w:multiLevelType w:val="multilevel"/>
     <w:tmpl w:val="04090021"/>
@@ -2755,20 +2937,115 @@
       </w:rPr>
     </w:lvl>
   </w:abstractNum>
+  <w:abstractNum w:abstractNumId="7" w15:restartNumberingAfterBreak="0">
+    <w:nsid w:val="795928FA"/>
+    <w:multiLevelType w:val="hybridMultilevel"/>
+    <w:tmpl w:val="8E6422FE"/>
+    <w:lvl w:ilvl="0" w:tplc="0409000F">
+      <w:start w:val="1"/>
+      <w:numFmt w:val="decimal"/>
+      <w:lvlText w:val="%1."/>
+      <w:lvlJc w:val="left"/>
+      <w:pPr>
+        <w:ind w:left="720" w:hanging="360"/>
+      </w:pPr>
+    </w:lvl>
+    <w:lvl w:ilvl="1" w:tplc="04090019" w:tentative="1">
+      <w:start w:val="1"/>
+      <w:numFmt w:val="lowerLetter"/>
+      <w:lvlText w:val="%2."/>
+      <w:lvlJc w:val="left"/>
+      <w:pPr>
+        <w:ind w:left="1440" w:hanging="360"/>
+      </w:pPr>
+    </w:lvl>
+    <w:lvl w:ilvl="2" w:tplc="0409001B" w:tentative="1">
+      <w:start w:val="1"/>
+      <w:numFmt w:val="lowerRoman"/>
+      <w:lvlText w:val="%3."/>
+      <w:lvlJc w:val="right"/>
+      <w:pPr>
+        <w:ind w:left="2160" w:hanging="180"/>
+      </w:pPr>
+    </w:lvl>
+    <w:lvl w:ilvl="3" w:tplc="0409000F" w:tentative="1">
+      <w:start w:val="1"/>
+      <w:numFmt w:val="decimal"/>
+      <w:lvlText w:val="%4."/>
+      <w:lvlJc w:val="left"/>
+      <w:pPr>
+        <w:ind w:left="2880" w:hanging="360"/>
+      </w:pPr>
+    </w:lvl>
+    <w:lvl w:ilvl="4" w:tplc="04090019" w:tentative="1">
+      <w:start w:val="1"/>
+      <w:numFmt w:val="lowerLetter"/>
+      <w:lvlText w:val="%5."/>
+      <w:lvlJc w:val="left"/>
+      <w:pPr>
+        <w:ind w:left="3600" w:hanging="360"/>
+      </w:pPr>
+    </w:lvl>
+    <w:lvl w:ilvl="5" w:tplc="0409001B" w:tentative="1">
+      <w:start w:val="1"/>
+      <w:numFmt w:val="lowerRoman"/>
+      <w:lvlText w:val="%6."/>
+      <w:lvlJc w:val="right"/>
+      <w:pPr>
+        <w:ind w:left="4320" w:hanging="180"/>
+      </w:pPr>
+    </w:lvl>
+    <w:lvl w:ilvl="6" w:tplc="0409000F" w:tentative="1">
+      <w:start w:val="1"/>
+      <w:numFmt w:val="decimal"/>
+      <w:lvlText w:val="%7."/>
+      <w:lvlJc w:val="left"/>
+      <w:pPr>
+        <w:ind w:left="5040" w:hanging="360"/>
+      </w:pPr>
+    </w:lvl>
+    <w:lvl w:ilvl="7" w:tplc="04090019" w:tentative="1">
+      <w:start w:val="1"/>
+      <w:numFmt w:val="lowerLetter"/>
+      <w:lvlText w:val="%8."/>
+      <w:lvlJc w:val="left"/>
+      <w:pPr>
+        <w:ind w:left="5760" w:hanging="360"/>
+      </w:pPr>
+    </w:lvl>
+    <w:lvl w:ilvl="8" w:tplc="0409001B" w:tentative="1">
+      <w:start w:val="1"/>
+      <w:numFmt w:val="lowerRoman"/>
+      <w:lvlText w:val="%9."/>
+      <w:lvlJc w:val="right"/>
+      <w:pPr>
+        <w:ind w:left="6480" w:hanging="180"/>
+      </w:pPr>
+    </w:lvl>
+  </w:abstractNum>
   <w:num w:numId="1">
+    <w:abstractNumId w:val="4"/>
+  </w:num>
+  <w:num w:numId="2">
+    <w:abstractNumId w:val="6"/>
+  </w:num>
+  <w:num w:numId="3">
+    <w:abstractNumId w:val="5"/>
+  </w:num>
+  <w:num w:numId="4">
+    <w:abstractNumId w:val="1"/>
+  </w:num>
+  <w:num w:numId="5">
     <w:abstractNumId w:val="2"/>
   </w:num>
-  <w:num w:numId="2">
-    <w:abstractNumId w:val="4"/>
-  </w:num>
-  <w:num w:numId="3">
-    <w:abstractNumId w:val="3"/>
-  </w:num>
-  <w:num w:numId="4">
+  <w:num w:numId="6">
     <w:abstractNumId w:val="0"/>
   </w:num>
-  <w:num w:numId="5">
-    <w:abstractNumId w:val="1"/>
+  <w:num w:numId="7">
+    <w:abstractNumId w:val="7"/>
+  </w:num>
+  <w:num w:numId="8">
+    <w:abstractNumId w:val="3"/>
   </w:num>
 </w:numbering>
 </file>

</xml_diff>